<commit_message>
manuale utente con immagini
</commit_message>
<xml_diff>
--- a/doc/Manuale Utente.docx
+++ b/doc/Manuale Utente.docx
@@ -7,7 +7,31 @@
         <w:pStyle w:val="Titolo2"/>
       </w:pPr>
       <w:r>
-        <w:t>Frontespizio (Titolo, Autori, Data e Versione documento)</w:t>
+        <w:t>Frontespizio (</w:t>
+      </w:r>
+      <w:r>
+        <w:t>cineMax – manuale utente</w:t>
+      </w:r>
+      <w:r>
+        <w:t xml:space="preserve">, </w:t>
+      </w:r>
+      <w:r>
+        <w:t>Galimberti Gaia, Necchio Arianna</w:t>
+      </w:r>
+      <w:r>
+        <w:t xml:space="preserve">, </w:t>
+      </w:r>
+      <w:r>
+        <w:t xml:space="preserve">16/09/2026, versione </w:t>
+      </w:r>
+      <w:r>
+        <w:rPr>
+          <w:highlight w:val="yellow"/>
+        </w:rPr>
+        <w:t>Versione documento</w:t>
+      </w:r>
+      <w:r>
+        <w:t>)</w:t>
       </w:r>
     </w:p>
     <w:p>
@@ -349,7 +373,13 @@
         <w:t xml:space="preserve">Si </w:t>
       </w:r>
       <w:r>
-        <w:t xml:space="preserve"> può ricercare una proiezione per vari criteri di ricerca.</w:t>
+        <w:t>pu</w:t>
+      </w:r>
+      <w:r>
+        <w:t>ò</w:t>
+      </w:r>
+      <w:r>
+        <w:t xml:space="preserve"> ricercare una proiezione per vari criteri di ricerca.</w:t>
       </w:r>
     </w:p>
     <w:p>
@@ -365,9 +395,43 @@
       </w:pPr>
       <w:r>
         <w:rPr>
-          <w:color w:val="EE0000"/>
+          <w:noProof/>
         </w:rPr>
-        <w:t>INSERIRE IMMAGINE DI AVVIO DELL’APP</w:t>
+        <w:drawing>
+          <wp:inline distT="0" distB="0" distL="0" distR="0" wp14:anchorId="13CA8CCB" wp14:editId="5C880290">
+            <wp:extent cx="2105025" cy="952500"/>
+            <wp:effectExtent l="0" t="0" r="9525" b="0"/>
+            <wp:docPr id="1630133409" name="Immagine 1"/>
+            <wp:cNvGraphicFramePr>
+              <a:graphicFrameLocks xmlns:a="http://schemas.openxmlformats.org/drawingml/2006/main" noChangeAspect="1"/>
+            </wp:cNvGraphicFramePr>
+            <a:graphic xmlns:a="http://schemas.openxmlformats.org/drawingml/2006/main">
+              <a:graphicData uri="http://schemas.openxmlformats.org/drawingml/2006/picture">
+                <pic:pic xmlns:pic="http://schemas.openxmlformats.org/drawingml/2006/picture">
+                  <pic:nvPicPr>
+                    <pic:cNvPr id="1630133409" name=""/>
+                    <pic:cNvPicPr/>
+                  </pic:nvPicPr>
+                  <pic:blipFill>
+                    <a:blip r:embed="rId6"/>
+                    <a:stretch>
+                      <a:fillRect/>
+                    </a:stretch>
+                  </pic:blipFill>
+                  <pic:spPr>
+                    <a:xfrm>
+                      <a:off x="0" y="0"/>
+                      <a:ext cx="2105025" cy="952500"/>
+                    </a:xfrm>
+                    <a:prstGeom prst="rect">
+                      <a:avLst/>
+                    </a:prstGeom>
+                  </pic:spPr>
+                </pic:pic>
+              </a:graphicData>
+            </a:graphic>
+          </wp:inline>
+        </w:drawing>
       </w:r>
     </w:p>
     <w:p>
@@ -383,63 +447,386 @@
     </w:p>
     <w:p>
       <w:r>
-        <w:t>L’applicazione chiede all’utente preventivamente registrato di inserire il proprio nome utente (username) e la password per accedere al programma; riconosce in automatico il ruolo dell’utente fornito dapprima in fase di registrazione (cliente, bigliettaio o proiezionista) e fa accedere di conseguenza alle funzionalità disposte al ruolo identificato. Nel caso di username o password non corretti, il programma ripropone all’utente di inserire nuovamente le proprie credenziali.</w:t>
-      </w:r>
-    </w:p>
-    <w:p>
-      <w:pPr>
+        <w:t>L’applicazione chiede all’utente preventivamente registrato di inserire il proprio usernam</w:t>
+      </w:r>
+      <w:r>
+        <w:t>e</w:t>
+      </w:r>
+      <w:r>
+        <w:t xml:space="preserve"> e la password per accedere al programma; riconosce in automatico il ruolo fornito dapprima in fase di registrazione (cliente, bigliettaio o proiezionista) e fa accedere di conseguenza alle funzionalità disposte al ruolo identificato. Nel caso di username o password non corretti, il programma ripropone all’utente di inserire nuovamente le proprie credenziali.</w:t>
+      </w:r>
+    </w:p>
+    <w:p>
+      <w:pPr>
+        <w:keepNext/>
+      </w:pPr>
+      <w:r>
+        <w:rPr>
+          <w:noProof/>
+        </w:rPr>
+        <w:lastRenderedPageBreak/>
+        <w:drawing>
+          <wp:inline distT="0" distB="0" distL="0" distR="0" wp14:anchorId="3F93CCC6" wp14:editId="24239D46">
+            <wp:extent cx="3381375" cy="2457450"/>
+            <wp:effectExtent l="0" t="0" r="9525" b="0"/>
+            <wp:docPr id="550199186" name="Immagine 1"/>
+            <wp:cNvGraphicFramePr>
+              <a:graphicFrameLocks xmlns:a="http://schemas.openxmlformats.org/drawingml/2006/main" noChangeAspect="1"/>
+            </wp:cNvGraphicFramePr>
+            <a:graphic xmlns:a="http://schemas.openxmlformats.org/drawingml/2006/main">
+              <a:graphicData uri="http://schemas.openxmlformats.org/drawingml/2006/picture">
+                <pic:pic xmlns:pic="http://schemas.openxmlformats.org/drawingml/2006/picture">
+                  <pic:nvPicPr>
+                    <pic:cNvPr id="550199186" name=""/>
+                    <pic:cNvPicPr/>
+                  </pic:nvPicPr>
+                  <pic:blipFill>
+                    <a:blip r:embed="rId7"/>
+                    <a:stretch>
+                      <a:fillRect/>
+                    </a:stretch>
+                  </pic:blipFill>
+                  <pic:spPr>
+                    <a:xfrm>
+                      <a:off x="0" y="0"/>
+                      <a:ext cx="3381375" cy="2457450"/>
+                    </a:xfrm>
+                    <a:prstGeom prst="rect">
+                      <a:avLst/>
+                    </a:prstGeom>
+                  </pic:spPr>
+                </pic:pic>
+              </a:graphicData>
+            </a:graphic>
+          </wp:inline>
+        </w:drawing>
+      </w:r>
+    </w:p>
+    <w:p>
+      <w:pPr>
+        <w:pStyle w:val="Didascalia"/>
         <w:rPr>
           <w:color w:val="EE0000"/>
         </w:rPr>
       </w:pPr>
       <w:r>
+        <w:t xml:space="preserve">Figura </w:t>
+      </w:r>
+      <w:fldSimple w:instr=" SEQ Figura \* ARABIC ">
+        <w:r>
+          <w:rPr>
+            <w:noProof/>
+          </w:rPr>
+          <w:t>1</w:t>
+        </w:r>
+      </w:fldSimple>
+      <w:r>
+        <w:t>Login lato cliente</w:t>
+      </w:r>
+    </w:p>
+    <w:p>
+      <w:pPr>
+        <w:keepNext/>
+      </w:pPr>
+      <w:r>
+        <w:drawing>
+          <wp:inline distT="0" distB="0" distL="0" distR="0" wp14:anchorId="516C3D2D" wp14:editId="4073CD7A">
+            <wp:extent cx="3771900" cy="2162175"/>
+            <wp:effectExtent l="0" t="0" r="0" b="9525"/>
+            <wp:docPr id="1486729566" name="Immagine 1"/>
+            <wp:cNvGraphicFramePr>
+              <a:graphicFrameLocks xmlns:a="http://schemas.openxmlformats.org/drawingml/2006/main" noChangeAspect="1"/>
+            </wp:cNvGraphicFramePr>
+            <a:graphic xmlns:a="http://schemas.openxmlformats.org/drawingml/2006/main">
+              <a:graphicData uri="http://schemas.openxmlformats.org/drawingml/2006/picture">
+                <pic:pic xmlns:pic="http://schemas.openxmlformats.org/drawingml/2006/picture">
+                  <pic:nvPicPr>
+                    <pic:cNvPr id="1486729566" name=""/>
+                    <pic:cNvPicPr/>
+                  </pic:nvPicPr>
+                  <pic:blipFill>
+                    <a:blip r:embed="rId8"/>
+                    <a:stretch>
+                      <a:fillRect/>
+                    </a:stretch>
+                  </pic:blipFill>
+                  <pic:spPr>
+                    <a:xfrm>
+                      <a:off x="0" y="0"/>
+                      <a:ext cx="3771900" cy="2162175"/>
+                    </a:xfrm>
+                    <a:prstGeom prst="rect">
+                      <a:avLst/>
+                    </a:prstGeom>
+                  </pic:spPr>
+                </pic:pic>
+              </a:graphicData>
+            </a:graphic>
+          </wp:inline>
+        </w:drawing>
+      </w:r>
+    </w:p>
+    <w:p>
+      <w:pPr>
+        <w:pStyle w:val="Didascalia"/>
+      </w:pPr>
+      <w:r>
+        <w:t xml:space="preserve">Figura </w:t>
+      </w:r>
+      <w:fldSimple w:instr=" SEQ Figura \* ARABIC ">
+        <w:r>
+          <w:rPr>
+            <w:noProof/>
+          </w:rPr>
+          <w:t>2</w:t>
+        </w:r>
+      </w:fldSimple>
+      <w:r>
+        <w:t>Login lato bigliettaio</w:t>
+      </w:r>
+    </w:p>
+    <w:p>
+      <w:pPr>
+        <w:keepNext/>
+      </w:pPr>
+      <w:r>
+        <w:drawing>
+          <wp:inline distT="0" distB="0" distL="0" distR="0" wp14:anchorId="2811F5F0" wp14:editId="5414C969">
+            <wp:extent cx="3762375" cy="2447925"/>
+            <wp:effectExtent l="0" t="0" r="9525" b="9525"/>
+            <wp:docPr id="1562699114" name="Immagine 1"/>
+            <wp:cNvGraphicFramePr>
+              <a:graphicFrameLocks xmlns:a="http://schemas.openxmlformats.org/drawingml/2006/main" noChangeAspect="1"/>
+            </wp:cNvGraphicFramePr>
+            <a:graphic xmlns:a="http://schemas.openxmlformats.org/drawingml/2006/main">
+              <a:graphicData uri="http://schemas.openxmlformats.org/drawingml/2006/picture">
+                <pic:pic xmlns:pic="http://schemas.openxmlformats.org/drawingml/2006/picture">
+                  <pic:nvPicPr>
+                    <pic:cNvPr id="1562699114" name=""/>
+                    <pic:cNvPicPr/>
+                  </pic:nvPicPr>
+                  <pic:blipFill>
+                    <a:blip r:embed="rId9"/>
+                    <a:stretch>
+                      <a:fillRect/>
+                    </a:stretch>
+                  </pic:blipFill>
+                  <pic:spPr>
+                    <a:xfrm>
+                      <a:off x="0" y="0"/>
+                      <a:ext cx="3762375" cy="2447925"/>
+                    </a:xfrm>
+                    <a:prstGeom prst="rect">
+                      <a:avLst/>
+                    </a:prstGeom>
+                  </pic:spPr>
+                </pic:pic>
+              </a:graphicData>
+            </a:graphic>
+          </wp:inline>
+        </w:drawing>
+      </w:r>
+    </w:p>
+    <w:p>
+      <w:pPr>
+        <w:pStyle w:val="Didascalia"/>
+      </w:pPr>
+      <w:r>
+        <w:t xml:space="preserve">Figura </w:t>
+      </w:r>
+      <w:fldSimple w:instr=" SEQ Figura \* ARABIC ">
+        <w:r>
+          <w:rPr>
+            <w:noProof/>
+          </w:rPr>
+          <w:t>3</w:t>
+        </w:r>
+      </w:fldSimple>
+      <w:r>
+        <w:t>Login lato proiezionista</w:t>
+      </w:r>
+    </w:p>
+    <w:p>
+      <w:pPr>
+        <w:keepNext/>
+      </w:pPr>
+      <w:r>
+        <w:lastRenderedPageBreak/>
+        <w:drawing>
+          <wp:inline distT="0" distB="0" distL="0" distR="0" wp14:anchorId="1D699CBB" wp14:editId="77AE736B">
+            <wp:extent cx="5400675" cy="1704975"/>
+            <wp:effectExtent l="0" t="0" r="9525" b="9525"/>
+            <wp:docPr id="2035649457" name="Immagine 1"/>
+            <wp:cNvGraphicFramePr>
+              <a:graphicFrameLocks xmlns:a="http://schemas.openxmlformats.org/drawingml/2006/main" noChangeAspect="1"/>
+            </wp:cNvGraphicFramePr>
+            <a:graphic xmlns:a="http://schemas.openxmlformats.org/drawingml/2006/main">
+              <a:graphicData uri="http://schemas.openxmlformats.org/drawingml/2006/picture">
+                <pic:pic xmlns:pic="http://schemas.openxmlformats.org/drawingml/2006/picture">
+                  <pic:nvPicPr>
+                    <pic:cNvPr id="2035649457" name=""/>
+                    <pic:cNvPicPr/>
+                  </pic:nvPicPr>
+                  <pic:blipFill>
+                    <a:blip r:embed="rId10"/>
+                    <a:stretch>
+                      <a:fillRect/>
+                    </a:stretch>
+                  </pic:blipFill>
+                  <pic:spPr>
+                    <a:xfrm>
+                      <a:off x="0" y="0"/>
+                      <a:ext cx="5400675" cy="1704975"/>
+                    </a:xfrm>
+                    <a:prstGeom prst="rect">
+                      <a:avLst/>
+                    </a:prstGeom>
+                  </pic:spPr>
+                </pic:pic>
+              </a:graphicData>
+            </a:graphic>
+          </wp:inline>
+        </w:drawing>
+      </w:r>
+    </w:p>
+    <w:p>
+      <w:pPr>
+        <w:pStyle w:val="Didascalia"/>
+      </w:pPr>
+      <w:r>
+        <w:t xml:space="preserve">Figura </w:t>
+      </w:r>
+      <w:fldSimple w:instr=" SEQ Figura \* ARABIC ">
+        <w:r>
+          <w:rPr>
+            <w:noProof/>
+          </w:rPr>
+          <w:t>4</w:t>
+        </w:r>
+      </w:fldSimple>
+      <w:r>
+        <w:t>Login fallito</w:t>
+      </w:r>
+    </w:p>
+    <w:p>
+      <w:pPr>
+        <w:pStyle w:val="Sottotitolo"/>
+      </w:pPr>
+      <w:r>
+        <w:t>Funzionalità di registrazione (scelta 2)</w:t>
+      </w:r>
+    </w:p>
+    <w:p>
+      <w:r>
+        <w:t>Un utente non ancora registrato al programma, prima di accedere alle specifiche funzionalità, si deve registrare. Viene chiesto di compilare i campi che il software propone: nome, cognome, username, password, data di nascita, domicilio e ruolo (utente, bigliettaio o proiezionista a seconda di quali funzioni si voglia disporre una volta registrati).</w:t>
+      </w:r>
+    </w:p>
+    <w:p>
+      <w:r>
+        <w:t xml:space="preserve">Una volta registrati, l’applicazione torna alla schermata di avvio e ripropone le tre possibili scelte. </w:t>
+      </w:r>
+    </w:p>
+    <w:p>
+      <w:r>
         <w:rPr>
-          <w:color w:val="EE0000"/>
+          <w:noProof/>
         </w:rPr>
-        <w:t>INSERIRE IMMAGINE DEL LOGIN CHE AVVIENE NEI CASI DI UTENTE, BIGLIETTAIO E PROIEZIONISTA E ANCH</w:t>
-      </w:r>
-      <w:r>
-        <w:rPr>
-          <w:color w:val="EE0000"/>
-        </w:rPr>
-        <w:t xml:space="preserve">E </w:t>
-      </w:r>
-      <w:r>
-        <w:rPr>
-          <w:color w:val="EE0000"/>
-        </w:rPr>
-        <w:t>IMMAGINE DEL LOGIN FALLITO</w:t>
-      </w:r>
-    </w:p>
-    <w:p>
-      <w:pPr>
-        <w:pStyle w:val="Sottotitolo"/>
-      </w:pPr>
-      <w:r>
-        <w:t>Funzionalità di registrazione (scelta 2)</w:t>
-      </w:r>
-    </w:p>
-    <w:p>
-      <w:r>
-        <w:t>Un utente non ancora registrato al programma, prima di accedere alle specifiche funzionalità, si deve registrare. Viene chiesto di compilare i campi che il software propone: nome, cognome, username, password, data di nascita, domicilio e ruolo (utente, bigliettaio o proiezionista a seconda di quali funzioni si voglia disporre una volta registrati).</w:t>
-      </w:r>
-    </w:p>
-    <w:p>
-      <w:r>
-        <w:t xml:space="preserve">Una volta registrati, l’applicazione torna alla schermata di avvio e ripropone le tre possibili scelte. </w:t>
-      </w:r>
-    </w:p>
-    <w:p>
-      <w:pPr>
-        <w:rPr>
-          <w:color w:val="EE0000"/>
-        </w:rPr>
-      </w:pPr>
-      <w:r>
-        <w:rPr>
-          <w:color w:val="EE0000"/>
-        </w:rPr>
-        <w:t>INSERIRE IMMAGINE DELLA REGISTRAZIONE</w:t>
+        <mc:AlternateContent>
+          <mc:Choice Requires="wpi">
+            <w:drawing>
+              <wp:anchor distT="0" distB="0" distL="114300" distR="114300" simplePos="0" relativeHeight="251659264" behindDoc="0" locked="0" layoutInCell="1" allowOverlap="1" wp14:anchorId="19EEDD27" wp14:editId="7B38FFD5">
+                <wp:simplePos x="0" y="0"/>
+                <wp:positionH relativeFrom="column">
+                  <wp:posOffset>600615</wp:posOffset>
+                </wp:positionH>
+                <wp:positionV relativeFrom="paragraph">
+                  <wp:posOffset>3062465</wp:posOffset>
+                </wp:positionV>
+                <wp:extent cx="126000" cy="120960"/>
+                <wp:effectExtent l="38100" t="38100" r="45720" b="50800"/>
+                <wp:wrapNone/>
+                <wp:docPr id="1504747266" name="Input penna 1"/>
+                <wp:cNvGraphicFramePr/>
+                <a:graphic xmlns:a="http://schemas.openxmlformats.org/drawingml/2006/main">
+                  <a:graphicData uri="http://schemas.microsoft.com/office/word/2010/wordprocessingInk">
+                    <w14:contentPart bwMode="auto" r:id="rId11">
+                      <w14:nvContentPartPr>
+                        <w14:cNvContentPartPr/>
+                      </w14:nvContentPartPr>
+                      <w14:xfrm>
+                        <a:off x="0" y="0"/>
+                        <a:ext cx="126000" cy="120960"/>
+                      </w14:xfrm>
+                    </w14:contentPart>
+                  </a:graphicData>
+                </a:graphic>
+              </wp:anchor>
+            </w:drawing>
+          </mc:Choice>
+          <mc:Fallback>
+            <w:pict>
+              <v:shapetype w14:anchorId="0A591951" id="_x0000_t75" coordsize="21600,21600" o:spt="75" o:preferrelative="t" path="m@4@5l@4@11@9@11@9@5xe" filled="f" stroked="f">
+                <v:stroke joinstyle="miter"/>
+                <v:formulas>
+                  <v:f eqn="if lineDrawn pixelLineWidth 0"/>
+                  <v:f eqn="sum @0 1 0"/>
+                  <v:f eqn="sum 0 0 @1"/>
+                  <v:f eqn="prod @2 1 2"/>
+                  <v:f eqn="prod @3 21600 pixelWidth"/>
+                  <v:f eqn="prod @3 21600 pixelHeight"/>
+                  <v:f eqn="sum @0 0 1"/>
+                  <v:f eqn="prod @6 1 2"/>
+                  <v:f eqn="prod @7 21600 pixelWidth"/>
+                  <v:f eqn="sum @8 21600 0"/>
+                  <v:f eqn="prod @7 21600 pixelHeight"/>
+                  <v:f eqn="sum @10 21600 0"/>
+                </v:formulas>
+                <v:path o:extrusionok="f" gradientshapeok="t" o:connecttype="rect"/>
+                <o:lock v:ext="edit" aspectratio="t"/>
+              </v:shapetype>
+              <v:shape id="Input penna 1" o:spid="_x0000_s1026" type="#_x0000_t75" style="position:absolute;margin-left:46.8pt;margin-top:240.65pt;width:10.9pt;height:10.5pt;z-index:251659264;visibility:visible;mso-wrap-style:square;mso-wrap-distance-left:9pt;mso-wrap-distance-top:0;mso-wrap-distance-right:9pt;mso-wrap-distance-bottom:0;mso-position-horizontal:absolute;mso-position-horizontal-relative:text;mso-position-vertical:absolute;mso-position-vertical-relative:text" o:gfxdata="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">
+                <v:imagedata r:id="rId12" o:title=""/>
+              </v:shape>
+            </w:pict>
+          </mc:Fallback>
+        </mc:AlternateContent>
+      </w:r>
+      <w:r>
+        <w:drawing>
+          <wp:inline distT="0" distB="0" distL="0" distR="0" wp14:anchorId="25EDCE2F" wp14:editId="0F5B80F2">
+            <wp:extent cx="5124450" cy="3248025"/>
+            <wp:effectExtent l="0" t="0" r="0" b="9525"/>
+            <wp:docPr id="127843006" name="Immagine 1"/>
+            <wp:cNvGraphicFramePr>
+              <a:graphicFrameLocks xmlns:a="http://schemas.openxmlformats.org/drawingml/2006/main" noChangeAspect="1"/>
+            </wp:cNvGraphicFramePr>
+            <a:graphic xmlns:a="http://schemas.openxmlformats.org/drawingml/2006/main">
+              <a:graphicData uri="http://schemas.openxmlformats.org/drawingml/2006/picture">
+                <pic:pic xmlns:pic="http://schemas.openxmlformats.org/drawingml/2006/picture">
+                  <pic:nvPicPr>
+                    <pic:cNvPr id="127843006" name=""/>
+                    <pic:cNvPicPr/>
+                  </pic:nvPicPr>
+                  <pic:blipFill>
+                    <a:blip r:embed="rId13"/>
+                    <a:stretch>
+                      <a:fillRect/>
+                    </a:stretch>
+                  </pic:blipFill>
+                  <pic:spPr>
+                    <a:xfrm>
+                      <a:off x="0" y="0"/>
+                      <a:ext cx="5124450" cy="3248025"/>
+                    </a:xfrm>
+                    <a:prstGeom prst="rect">
+                      <a:avLst/>
+                    </a:prstGeom>
+                  </pic:spPr>
+                </pic:pic>
+              </a:graphicData>
+            </a:graphic>
+          </wp:inline>
+        </w:drawing>
       </w:r>
     </w:p>
     <w:p>
@@ -465,6 +852,59 @@
       </w:r>
     </w:p>
     <w:p>
+      <w:r>
+        <w:lastRenderedPageBreak/>
+        <w:drawing>
+          <wp:inline distT="0" distB="0" distL="0" distR="0" wp14:anchorId="35649AC2" wp14:editId="6F91C776">
+            <wp:extent cx="3295650" cy="3076575"/>
+            <wp:effectExtent l="0" t="0" r="0" b="9525"/>
+            <wp:docPr id="1632625576" name="Immagine 1"/>
+            <wp:cNvGraphicFramePr>
+              <a:graphicFrameLocks xmlns:a="http://schemas.openxmlformats.org/drawingml/2006/main" noChangeAspect="1"/>
+            </wp:cNvGraphicFramePr>
+            <a:graphic xmlns:a="http://schemas.openxmlformats.org/drawingml/2006/main">
+              <a:graphicData uri="http://schemas.openxmlformats.org/drawingml/2006/picture">
+                <pic:pic xmlns:pic="http://schemas.openxmlformats.org/drawingml/2006/picture">
+                  <pic:nvPicPr>
+                    <pic:cNvPr id="1632625576" name=""/>
+                    <pic:cNvPicPr/>
+                  </pic:nvPicPr>
+                  <pic:blipFill>
+                    <a:blip r:embed="rId14"/>
+                    <a:stretch>
+                      <a:fillRect/>
+                    </a:stretch>
+                  </pic:blipFill>
+                  <pic:spPr>
+                    <a:xfrm>
+                      <a:off x="0" y="0"/>
+                      <a:ext cx="3295650" cy="3076575"/>
+                    </a:xfrm>
+                    <a:prstGeom prst="rect">
+                      <a:avLst/>
+                    </a:prstGeom>
+                  </pic:spPr>
+                </pic:pic>
+              </a:graphicData>
+            </a:graphic>
+          </wp:inline>
+        </w:drawing>
+      </w:r>
+    </w:p>
+    <w:p>
+      <w:pPr>
+        <w:pStyle w:val="Sottotitolo"/>
+      </w:pPr>
+      <w:r>
+        <w:t>Terminare il programma</w:t>
+      </w:r>
+    </w:p>
+    <w:p>
+      <w:r>
+        <w:t>Il menù di benvenuto offre la possibilità di digitare “0” per terminare correttamente l’applicazione senza che il suo funzionamento venga interrotto in modo anomalo.</w:t>
+      </w:r>
+    </w:p>
+    <w:p>
       <w:pPr>
         <w:rPr>
           <w:color w:val="EE0000"/>
@@ -472,36 +912,43 @@
       </w:pPr>
       <w:r>
         <w:rPr>
-          <w:color w:val="EE0000"/>
+          <w:noProof/>
         </w:rPr>
-        <w:lastRenderedPageBreak/>
-        <w:t>IMMAGINE CHE FA VEDERE IL cercaProiezione() CON VARI CRITERI DI RICERCA</w:t>
-      </w:r>
-    </w:p>
-    <w:p>
-      <w:pPr>
-        <w:pStyle w:val="Sottotitolo"/>
-      </w:pPr>
-      <w:r>
-        <w:t>Terminare il programma</w:t>
-      </w:r>
-    </w:p>
-    <w:p>
-      <w:r>
-        <w:t>Il menù di benvenuto offre la possibilità di digitare “0” per terminare correttamente l’applicazione senza che il suo funzionamento venga interrotto in modo anomalo.</w:t>
-      </w:r>
-    </w:p>
-    <w:p>
-      <w:pPr>
-        <w:rPr>
-          <w:color w:val="EE0000"/>
-        </w:rPr>
-      </w:pPr>
-      <w:r>
-        <w:rPr>
-          <w:color w:val="EE0000"/>
-        </w:rPr>
-        <w:t>IMMAGINE DEL 0 PER USCIRE</w:t>
+        <w:drawing>
+          <wp:inline distT="0" distB="0" distL="0" distR="0" wp14:anchorId="6FCE4B38" wp14:editId="58289B4E">
+            <wp:extent cx="2095500" cy="1266825"/>
+            <wp:effectExtent l="0" t="0" r="0" b="9525"/>
+            <wp:docPr id="46593745" name="Immagine 1"/>
+            <wp:cNvGraphicFramePr>
+              <a:graphicFrameLocks xmlns:a="http://schemas.openxmlformats.org/drawingml/2006/main" noChangeAspect="1"/>
+            </wp:cNvGraphicFramePr>
+            <a:graphic xmlns:a="http://schemas.openxmlformats.org/drawingml/2006/main">
+              <a:graphicData uri="http://schemas.openxmlformats.org/drawingml/2006/picture">
+                <pic:pic xmlns:pic="http://schemas.openxmlformats.org/drawingml/2006/picture">
+                  <pic:nvPicPr>
+                    <pic:cNvPr id="46593745" name=""/>
+                    <pic:cNvPicPr/>
+                  </pic:nvPicPr>
+                  <pic:blipFill>
+                    <a:blip r:embed="rId15"/>
+                    <a:stretch>
+                      <a:fillRect/>
+                    </a:stretch>
+                  </pic:blipFill>
+                  <pic:spPr>
+                    <a:xfrm>
+                      <a:off x="0" y="0"/>
+                      <a:ext cx="2095500" cy="1266825"/>
+                    </a:xfrm>
+                    <a:prstGeom prst="rect">
+                      <a:avLst/>
+                    </a:prstGeom>
+                  </pic:spPr>
+                </pic:pic>
+              </a:graphicData>
+            </a:graphic>
+          </wp:inline>
+        </w:drawing>
       </w:r>
     </w:p>
     <w:p>
@@ -532,10 +979,7 @@
         </w:numPr>
       </w:pPr>
       <w:r>
-        <w:t>creare una nuova prenotazione</w:t>
-      </w:r>
-      <w:r>
-        <w:t xml:space="preserve">: è possibile creare una nuova prenotazione specificando, attraverso una compilazione guidata, i dati necessari (numero dei biglietti che si desidera acquistare, </w:t>
+        <w:t xml:space="preserve">creare una nuova prenotazione: è possibile creare una nuova prenotazione specificando, attraverso una compilazione guidata, i dati necessari (numero dei biglietti che si desidera acquistare, </w:t>
       </w:r>
       <w:r>
         <w:t>a patto che non superino la capacità della sala di 200 posti, il proprio nome e cognome a cui associare la prenotazione, il titolo del film che si desidera visionare e la data di proiezione del film in oggetto). In automatico viene generato un codice univoco che è associato alla prenotazione.</w:t>
@@ -544,16 +988,58 @@
     <w:p>
       <w:pPr>
         <w:pStyle w:val="Paragrafoelenco"/>
+      </w:pPr>
+    </w:p>
+    <w:p>
+      <w:pPr>
+        <w:pStyle w:val="Paragrafoelenco"/>
+      </w:pPr>
+      <w:r>
         <w:rPr>
-          <w:color w:val="EE0000"/>
+          <w:noProof/>
         </w:rPr>
-      </w:pPr>
-      <w:r>
-        <w:rPr>
-          <w:color w:val="EE0000"/>
-        </w:rPr>
-        <w:t>METTERE IMMAGINE DEL craprenotazione() in csvReader</w:t>
-      </w:r>
+        <w:lastRenderedPageBreak/>
+        <w:drawing>
+          <wp:inline distT="0" distB="0" distL="0" distR="0" wp14:anchorId="57524296" wp14:editId="09D14C29">
+            <wp:extent cx="5295900" cy="2343150"/>
+            <wp:effectExtent l="0" t="0" r="0" b="0"/>
+            <wp:docPr id="1800862701" name="Immagine 1"/>
+            <wp:cNvGraphicFramePr>
+              <a:graphicFrameLocks xmlns:a="http://schemas.openxmlformats.org/drawingml/2006/main" noChangeAspect="1"/>
+            </wp:cNvGraphicFramePr>
+            <a:graphic xmlns:a="http://schemas.openxmlformats.org/drawingml/2006/main">
+              <a:graphicData uri="http://schemas.openxmlformats.org/drawingml/2006/picture">
+                <pic:pic xmlns:pic="http://schemas.openxmlformats.org/drawingml/2006/picture">
+                  <pic:nvPicPr>
+                    <pic:cNvPr id="1800862701" name=""/>
+                    <pic:cNvPicPr/>
+                  </pic:nvPicPr>
+                  <pic:blipFill>
+                    <a:blip r:embed="rId16"/>
+                    <a:stretch>
+                      <a:fillRect/>
+                    </a:stretch>
+                  </pic:blipFill>
+                  <pic:spPr>
+                    <a:xfrm>
+                      <a:off x="0" y="0"/>
+                      <a:ext cx="5295900" cy="2343150"/>
+                    </a:xfrm>
+                    <a:prstGeom prst="rect">
+                      <a:avLst/>
+                    </a:prstGeom>
+                  </pic:spPr>
+                </pic:pic>
+              </a:graphicData>
+            </a:graphic>
+          </wp:inline>
+        </w:drawing>
+      </w:r>
+    </w:p>
+    <w:p>
+      <w:pPr>
+        <w:pStyle w:val="Paragrafoelenco"/>
+      </w:pPr>
     </w:p>
     <w:p>
       <w:pPr>
@@ -572,7 +1058,80 @@
     </w:p>
     <w:p>
       <w:pPr>
+        <w:ind w:left="360" w:firstLine="348"/>
+      </w:pPr>
+      <w:r>
+        <w:drawing>
+          <wp:inline distT="0" distB="0" distL="0" distR="0" wp14:anchorId="5E9053A2" wp14:editId="61E5521B">
+            <wp:extent cx="5734050" cy="1704975"/>
+            <wp:effectExtent l="0" t="0" r="0" b="9525"/>
+            <wp:docPr id="569178322" name="Immagine 1"/>
+            <wp:cNvGraphicFramePr>
+              <a:graphicFrameLocks xmlns:a="http://schemas.openxmlformats.org/drawingml/2006/main" noChangeAspect="1"/>
+            </wp:cNvGraphicFramePr>
+            <a:graphic xmlns:a="http://schemas.openxmlformats.org/drawingml/2006/main">
+              <a:graphicData uri="http://schemas.openxmlformats.org/drawingml/2006/picture">
+                <pic:pic xmlns:pic="http://schemas.openxmlformats.org/drawingml/2006/picture">
+                  <pic:nvPicPr>
+                    <pic:cNvPr id="569178322" name=""/>
+                    <pic:cNvPicPr/>
+                  </pic:nvPicPr>
+                  <pic:blipFill>
+                    <a:blip r:embed="rId17"/>
+                    <a:stretch>
+                      <a:fillRect/>
+                    </a:stretch>
+                  </pic:blipFill>
+                  <pic:spPr>
+                    <a:xfrm>
+                      <a:off x="0" y="0"/>
+                      <a:ext cx="5734050" cy="1704975"/>
+                    </a:xfrm>
+                    <a:prstGeom prst="rect">
+                      <a:avLst/>
+                    </a:prstGeom>
+                  </pic:spPr>
+                </pic:pic>
+              </a:graphicData>
+            </a:graphic>
+          </wp:inline>
+        </w:drawing>
+      </w:r>
+    </w:p>
+    <w:p>
+      <w:pPr>
+        <w:ind w:left="360"/>
+      </w:pPr>
+      <w:r>
+        <w:t>3.</w:t>
+      </w:r>
+      <w:r>
+        <w:tab/>
+      </w:r>
+      <w:r>
+        <w:t>modificare una prenotazione</w:t>
+      </w:r>
+      <w:r>
+        <w:t xml:space="preserve">: </w:t>
+      </w:r>
+    </w:p>
+    <w:p>
+      <w:pPr>
         <w:pStyle w:val="Paragrafoelenco"/>
+        <w:numPr>
+          <w:ilvl w:val="0"/>
+          <w:numId w:val="1"/>
+        </w:numPr>
+      </w:pPr>
+      <w:r>
+        <w:t>eliminare una prenotazione</w:t>
+      </w:r>
+      <w:r>
+        <w:t>:</w:t>
+      </w:r>
+    </w:p>
+    <w:p>
+      <w:pPr>
         <w:rPr>
           <w:color w:val="EE0000"/>
         </w:rPr>
@@ -581,7 +1140,111 @@
         <w:rPr>
           <w:color w:val="EE0000"/>
         </w:rPr>
-        <w:t>METTERE IMMAGINE DEL visualizaPrenotazione()</w:t>
+        <w:t>INSERIRE IMMAGINI DEL MODIFICA E ELIMINA</w:t>
+      </w:r>
+    </w:p>
+    <w:p>
+      <w:r>
+        <w:t>La scelta “0” è possibile per uscire dalle funzioni del cliente e tornare alla schermata di avvio.</w:t>
+      </w:r>
+    </w:p>
+    <w:p>
+      <w:pPr>
+        <w:pStyle w:val="Citazioneintensa"/>
+      </w:pPr>
+      <w:r>
+        <w:t>FUNZIONI DEL RUOLO “BIGLIETTAIO”</w:t>
+      </w:r>
+    </w:p>
+    <w:p>
+      <w:r>
+        <w:t>Accedendo con il profilo di “bigliettaio” si ha a disposizione l’unica funzione per ricercare una prenotazione, oltre alla possibilità di ritornare al menu di avvio.</w:t>
+      </w:r>
+    </w:p>
+    <w:p>
+      <w:r>
+        <w:t>Digitando “1” alla voce “Scelta:“ viene chiesto di ricercare una prenotazione scegliendo tra uno dei quattro criteri di ricerca proposti: codice della prenotazione, nome e cognome del cliente, titolo del film e intervallo di date.</w:t>
+      </w:r>
+    </w:p>
+    <w:p>
+      <w:r>
+        <w:t>Una volta scelto, viene chiesto di fornire il dato con cui compiere la ricerca</w:t>
+      </w:r>
+    </w:p>
+    <w:p>
+      <w:pPr>
+        <w:rPr>
+          <w:color w:val="EE0000"/>
+        </w:rPr>
+      </w:pPr>
+      <w:r>
+        <w:rPr>
+          <w:color w:val="EE0000"/>
+        </w:rPr>
+        <w:t>INSERIRE IMMAGINE DEL CERCAPROIEZIONE</w:t>
+      </w:r>
+    </w:p>
+    <w:p/>
+    <w:p>
+      <w:pPr>
+        <w:pStyle w:val="Citazioneintensa"/>
+      </w:pPr>
+      <w:r>
+        <w:lastRenderedPageBreak/>
+        <w:t>FUNZIONI DEL RUOLO “PROIEZIONISTA”</w:t>
+      </w:r>
+    </w:p>
+    <w:p>
+      <w:r>
+        <w:t xml:space="preserve">Se invece alla piattaforma ci si è loggati con il profilo di “proiezionista”, si ha a disposizione tre funzionalità, oltre alla consueta </w:t>
+      </w:r>
+      <w:r>
+        <w:t xml:space="preserve">(scelta: 0) </w:t>
+      </w:r>
+      <w:r>
+        <w:t xml:space="preserve">per tornare alla schermata home: </w:t>
+      </w:r>
+    </w:p>
+    <w:p>
+      <w:r>
+        <w:rPr>
+          <w:noProof/>
+        </w:rPr>
+        <w:drawing>
+          <wp:inline distT="0" distB="0" distL="0" distR="0" wp14:anchorId="54AE36DB" wp14:editId="3A7B40A2">
+            <wp:extent cx="2190750" cy="942975"/>
+            <wp:effectExtent l="0" t="0" r="0" b="9525"/>
+            <wp:docPr id="276713444" name="Immagine 1"/>
+            <wp:cNvGraphicFramePr>
+              <a:graphicFrameLocks xmlns:a="http://schemas.openxmlformats.org/drawingml/2006/main" noChangeAspect="1"/>
+            </wp:cNvGraphicFramePr>
+            <a:graphic xmlns:a="http://schemas.openxmlformats.org/drawingml/2006/main">
+              <a:graphicData uri="http://schemas.openxmlformats.org/drawingml/2006/picture">
+                <pic:pic xmlns:pic="http://schemas.openxmlformats.org/drawingml/2006/picture">
+                  <pic:nvPicPr>
+                    <pic:cNvPr id="276713444" name=""/>
+                    <pic:cNvPicPr/>
+                  </pic:nvPicPr>
+                  <pic:blipFill>
+                    <a:blip r:embed="rId18"/>
+                    <a:stretch>
+                      <a:fillRect/>
+                    </a:stretch>
+                  </pic:blipFill>
+                  <pic:spPr>
+                    <a:xfrm>
+                      <a:off x="0" y="0"/>
+                      <a:ext cx="2190750" cy="942975"/>
+                    </a:xfrm>
+                    <a:prstGeom prst="rect">
+                      <a:avLst/>
+                    </a:prstGeom>
+                  </pic:spPr>
+                </pic:pic>
+              </a:graphicData>
+            </a:graphic>
+          </wp:inline>
+        </w:drawing>
       </w:r>
     </w:p>
     <w:p>
@@ -589,14 +1252,56 @@
         <w:pStyle w:val="Paragrafoelenco"/>
         <w:numPr>
           <w:ilvl w:val="0"/>
-          <w:numId w:val="2"/>
+          <w:numId w:val="3"/>
         </w:numPr>
       </w:pPr>
       <w:r>
-        <w:t>modificare una prenotazione</w:t>
-      </w:r>
-      <w:r>
-        <w:t xml:space="preserve">: </w:t>
+        <w:t>aggiungere una proiezione: viene richiesto di inserire i dati relativi al film (titolo, genere, regista, anno di produzione, durata in minuti, età minima a cui è consentita la visione), e alla proiezione (giorno e ora in cui viene proiettato il film e il prezzo del biglietto). Nel caso la data inserita (giorno e ora) si accavalla con una già esistente, è fornito all’utente un messaggio di avvertimento; al contrario l’applicazione procede al salvataggio della nuova proiezione confermando l’azione con un messaggio opportuno.</w:t>
+      </w:r>
+    </w:p>
+    <w:p>
+      <w:pPr>
+        <w:ind w:left="360"/>
+      </w:pPr>
+      <w:r>
+        <w:rPr>
+          <w:noProof/>
+        </w:rPr>
+        <w:drawing>
+          <wp:inline distT="0" distB="0" distL="0" distR="0" wp14:anchorId="30BFC11A" wp14:editId="4CDCB0D5">
+            <wp:extent cx="6120130" cy="2779395"/>
+            <wp:effectExtent l="0" t="0" r="0" b="1905"/>
+            <wp:docPr id="1227746273" name="Immagine 1"/>
+            <wp:cNvGraphicFramePr>
+              <a:graphicFrameLocks xmlns:a="http://schemas.openxmlformats.org/drawingml/2006/main" noChangeAspect="1"/>
+            </wp:cNvGraphicFramePr>
+            <a:graphic xmlns:a="http://schemas.openxmlformats.org/drawingml/2006/main">
+              <a:graphicData uri="http://schemas.openxmlformats.org/drawingml/2006/picture">
+                <pic:pic xmlns:pic="http://schemas.openxmlformats.org/drawingml/2006/picture">
+                  <pic:nvPicPr>
+                    <pic:cNvPr id="1227746273" name=""/>
+                    <pic:cNvPicPr/>
+                  </pic:nvPicPr>
+                  <pic:blipFill>
+                    <a:blip r:embed="rId19"/>
+                    <a:stretch>
+                      <a:fillRect/>
+                    </a:stretch>
+                  </pic:blipFill>
+                  <pic:spPr>
+                    <a:xfrm>
+                      <a:off x="0" y="0"/>
+                      <a:ext cx="6120130" cy="2779395"/>
+                    </a:xfrm>
+                    <a:prstGeom prst="rect">
+                      <a:avLst/>
+                    </a:prstGeom>
+                  </pic:spPr>
+                </pic:pic>
+              </a:graphicData>
+            </a:graphic>
+          </wp:inline>
+        </w:drawing>
       </w:r>
     </w:p>
     <w:p>
@@ -604,40 +1309,23 @@
         <w:pStyle w:val="Paragrafoelenco"/>
         <w:numPr>
           <w:ilvl w:val="0"/>
-          <w:numId w:val="2"/>
+          <w:numId w:val="3"/>
         </w:numPr>
       </w:pPr>
       <w:r>
-        <w:t>eliminare una prenotazione</w:t>
-      </w:r>
-      <w:r>
-        <w:t>:</w:t>
-      </w:r>
-    </w:p>
-    <w:p>
-      <w:r>
-        <w:t>La scelta “0” è possibile per uscire dalle funzioni del cliente e tornare alla schermata di avvio.</w:t>
-      </w:r>
-    </w:p>
-    <w:p>
-      <w:pPr>
-        <w:pStyle w:val="Citazioneintensa"/>
-      </w:pPr>
-      <w:r>
-        <w:t>FUNZIONI DEL RUOLO “BIGLIETTAIO”</w:t>
-      </w:r>
-    </w:p>
-    <w:p>
-      <w:r>
-        <w:t>AA</w:t>
-      </w:r>
-    </w:p>
-    <w:p>
-      <w:pPr>
-        <w:pStyle w:val="Citazioneintensa"/>
-      </w:pPr>
-      <w:r>
-        <w:t>FUNZIONI DEL RUOLO “PROIEZIONISTA”</w:t>
+        <w:t>modificare una proiezione</w:t>
+      </w:r>
+    </w:p>
+    <w:p>
+      <w:pPr>
+        <w:pStyle w:val="Paragrafoelenco"/>
+        <w:numPr>
+          <w:ilvl w:val="0"/>
+          <w:numId w:val="3"/>
+        </w:numPr>
+      </w:pPr>
+      <w:r>
+        <w:t>eliminare una proiezione</w:t>
       </w:r>
     </w:p>
     <w:p/>
@@ -693,7 +1381,7 @@
       </w:r>
     </w:p>
     <w:p>
-      <w:hyperlink r:id="rId5" w:history="1">
+      <w:hyperlink r:id="rId20" w:history="1">
         <w:r>
           <w:rPr>
             <w:rStyle w:val="Collegamentoipertestuale"/>
@@ -893,11 +1581,103 @@
       </w:pPr>
     </w:lvl>
   </w:abstractNum>
+  <w:abstractNum w:abstractNumId="2" w15:restartNumberingAfterBreak="0">
+    <w:nsid w:val="5A3270C0"/>
+    <w:multiLevelType w:val="hybridMultilevel"/>
+    <w:tmpl w:val="E6447978"/>
+    <w:lvl w:ilvl="0" w:tplc="0410000F">
+      <w:start w:val="1"/>
+      <w:numFmt w:val="decimal"/>
+      <w:lvlText w:val="%1."/>
+      <w:lvlJc w:val="left"/>
+      <w:pPr>
+        <w:ind w:left="720" w:hanging="360"/>
+      </w:pPr>
+      <w:rPr>
+        <w:rFonts w:hint="default"/>
+      </w:rPr>
+    </w:lvl>
+    <w:lvl w:ilvl="1" w:tplc="04100019" w:tentative="1">
+      <w:start w:val="1"/>
+      <w:numFmt w:val="lowerLetter"/>
+      <w:lvlText w:val="%2."/>
+      <w:lvlJc w:val="left"/>
+      <w:pPr>
+        <w:ind w:left="1440" w:hanging="360"/>
+      </w:pPr>
+    </w:lvl>
+    <w:lvl w:ilvl="2" w:tplc="0410001B" w:tentative="1">
+      <w:start w:val="1"/>
+      <w:numFmt w:val="lowerRoman"/>
+      <w:lvlText w:val="%3."/>
+      <w:lvlJc w:val="right"/>
+      <w:pPr>
+        <w:ind w:left="2160" w:hanging="180"/>
+      </w:pPr>
+    </w:lvl>
+    <w:lvl w:ilvl="3" w:tplc="0410000F" w:tentative="1">
+      <w:start w:val="1"/>
+      <w:numFmt w:val="decimal"/>
+      <w:lvlText w:val="%4."/>
+      <w:lvlJc w:val="left"/>
+      <w:pPr>
+        <w:ind w:left="2880" w:hanging="360"/>
+      </w:pPr>
+    </w:lvl>
+    <w:lvl w:ilvl="4" w:tplc="04100019" w:tentative="1">
+      <w:start w:val="1"/>
+      <w:numFmt w:val="lowerLetter"/>
+      <w:lvlText w:val="%5."/>
+      <w:lvlJc w:val="left"/>
+      <w:pPr>
+        <w:ind w:left="3600" w:hanging="360"/>
+      </w:pPr>
+    </w:lvl>
+    <w:lvl w:ilvl="5" w:tplc="0410001B" w:tentative="1">
+      <w:start w:val="1"/>
+      <w:numFmt w:val="lowerRoman"/>
+      <w:lvlText w:val="%6."/>
+      <w:lvlJc w:val="right"/>
+      <w:pPr>
+        <w:ind w:left="4320" w:hanging="180"/>
+      </w:pPr>
+    </w:lvl>
+    <w:lvl w:ilvl="6" w:tplc="0410000F" w:tentative="1">
+      <w:start w:val="1"/>
+      <w:numFmt w:val="decimal"/>
+      <w:lvlText w:val="%7."/>
+      <w:lvlJc w:val="left"/>
+      <w:pPr>
+        <w:ind w:left="5040" w:hanging="360"/>
+      </w:pPr>
+    </w:lvl>
+    <w:lvl w:ilvl="7" w:tplc="04100019" w:tentative="1">
+      <w:start w:val="1"/>
+      <w:numFmt w:val="lowerLetter"/>
+      <w:lvlText w:val="%8."/>
+      <w:lvlJc w:val="left"/>
+      <w:pPr>
+        <w:ind w:left="5760" w:hanging="360"/>
+      </w:pPr>
+    </w:lvl>
+    <w:lvl w:ilvl="8" w:tplc="0410001B" w:tentative="1">
+      <w:start w:val="1"/>
+      <w:numFmt w:val="lowerRoman"/>
+      <w:lvlText w:val="%9."/>
+      <w:lvlJc w:val="right"/>
+      <w:pPr>
+        <w:ind w:left="6480" w:hanging="180"/>
+      </w:pPr>
+    </w:lvl>
+  </w:abstractNum>
   <w:num w:numId="1" w16cid:durableId="844244759">
     <w:abstractNumId w:val="1"/>
   </w:num>
   <w:num w:numId="2" w16cid:durableId="474028703">
     <w:abstractNumId w:val="0"/>
+  </w:num>
+  <w:num w:numId="3" w16cid:durableId="1859998497">
+    <w:abstractNumId w:val="2"/>
   </w:num>
 </w:numbering>
 </file>
@@ -1836,7 +2616,53 @@
       <w:shd w:val="clear" w:color="auto" w:fill="E1DFDD"/>
     </w:rPr>
   </w:style>
+  <w:style w:type="paragraph" w:styleId="Didascalia">
+    <w:name w:val="caption"/>
+    <w:basedOn w:val="Normale"/>
+    <w:next w:val="Normale"/>
+    <w:uiPriority w:val="35"/>
+    <w:unhideWhenUsed/>
+    <w:qFormat/>
+    <w:rsid w:val="00052EF0"/>
+    <w:pPr>
+      <w:spacing w:after="200" w:line="240" w:lineRule="auto"/>
+    </w:pPr>
+    <w:rPr>
+      <w:i/>
+      <w:iCs/>
+      <w:color w:val="44546A" w:themeColor="text2"/>
+      <w:sz w:val="18"/>
+      <w:szCs w:val="18"/>
+    </w:rPr>
+  </w:style>
 </w:styles>
+</file>
+
+<file path=word/ink/ink1.xml><?xml version="1.0" encoding="utf-8"?>
+<inkml:ink xmlns:inkml="http://www.w3.org/2003/InkML">
+  <inkml:definitions>
+    <inkml:context xml:id="ctx0">
+      <inkml:inkSource xml:id="inkSrc0">
+        <inkml:traceFormat>
+          <inkml:channel name="X" type="integer" min="-2.14748E9" max="2.14748E9" units="cm"/>
+          <inkml:channel name="Y" type="integer" min="-2.14748E9" max="2.14748E9" units="cm"/>
+          <inkml:channel name="F" type="integer" max="32767" units="dev"/>
+        </inkml:traceFormat>
+        <inkml:channelProperties>
+          <inkml:channelProperty channel="X" name="resolution" value="1000" units="1/cm"/>
+          <inkml:channelProperty channel="Y" name="resolution" value="1000" units="1/cm"/>
+          <inkml:channelProperty channel="F" name="resolution" value="0" units="1/dev"/>
+        </inkml:channelProperties>
+      </inkml:inkSource>
+      <inkml:timestamp xml:id="ts0" timeString="2026-07-02T16:29:04.228"/>
+    </inkml:context>
+    <inkml:brush xml:id="br0">
+      <inkml:brushProperty name="width" value="0.035" units="cm"/>
+      <inkml:brushProperty name="height" value="0.035" units="cm"/>
+    </inkml:brush>
+  </inkml:definitions>
+  <inkml:trace contextRef="#ctx0" brushRef="#br0">247 72 24575,'-3'0'0,"-1"0"0,1 0 0,0 1 0,-1 0 0,1-1 0,0 1 0,0 0 0,0 0 0,0 1 0,0-1 0,0 0 0,0 1 0,0 0 0,0 0 0,1 0 0,-1 0 0,1 0 0,-1 1 0,1-1 0,0 1 0,0-1 0,0 1 0,0 0 0,1 0 0,-1 0 0,1 0 0,-1 0 0,1 0 0,0 0 0,0 0 0,0 6 0,-2 10 0,0 0 0,2 1 0,0-1 0,3 26 0,-1-23 0,3 2 0,-4-24 0,1 0 0,-1 0 0,0 1 0,0-1 0,0 0 0,1 0 0,-1 0 0,0 0 0,0 0 0,0 0 0,1 0 0,-1 0 0,0 0 0,0 0 0,1 0 0,-1 0 0,0 0 0,0 0 0,0 0 0,1 0 0,-1 0 0,0 0 0,0 0 0,0 0 0,1 0 0,-1 0 0,0 0 0,0 0 0,0-1 0,1 1 0,-1 0 0,0 0 0,0 0 0,0 0 0,0 0 0,1-1 0,-1 1 0,0 0 0,0 0 0,0 0 0,0 0 0,0-1 0,0 1 0,0 0 0,1 0 0,-1-1 0,2-3 0,0 0 0,0 0 0,0 0 0,-1 0 0,0-1 0,0 1 0,1-7 0,0-30 0,-2 14 0,1 25 0,0 10 0,-1-7 0,0 1 0,0-1 0,0 0 0,0 0 0,0 0 0,1 0 0,-1 0 0,0 0 0,0 0 0,1 0 0,-1 0 0,1 0 0,-1 0 0,1 0 0,-1 0 0,1 0 0,0 0 0,-1 0 0,1 0 0,0 0 0,0-1 0,-1 1 0,1 0 0,0 0 0,0-1 0,1 1 0,0-1 0,-1 0 0,0 0 0,0 0 0,0-1 0,1 1 0,-1-1 0,0 1 0,0-1 0,0 1 0,0-1 0,1 1 0,-1-1 0,0 0 0,0 0 0,-1 0 0,1 0 0,0 1 0,1-3 0,3-3 0,-1 1 0,1-1 0,-1 0 0,-1-1 0,1 1 0,-1-1 0,2-6 0,-4 12 0,-1-1 0,0 1 0,0 0 0,0 0 0,0 0 0,0 0 0,0 0 0,0-1 0,0 1 0,0 0 0,-1 0 0,1 0 0,0 0 0,-1 0 0,1 0 0,-1 0 0,1 0 0,-1 0 0,1 0 0,-1 0 0,0 0 0,0 0 0,1 0 0,-1 0 0,0 0 0,0 1 0,0-1 0,0 0 0,0 1 0,0-1 0,0 1 0,0-1 0,0 1 0,0-1 0,0 1 0,0 0 0,-3-1 0,-20-12 0,23 12 0,0 0 0,0 0 0,0 0 0,0 0 0,-1 0 0,1 0 0,0 0 0,-1 1 0,1-1 0,-1 0 0,1 1 0,-1-1 0,1 1 0,-1 0 0,1 0 0,-1-1 0,1 1 0,-1 0 0,1 0 0,-1 0 0,1 1 0,-1-1 0,0 0 0,1 0 0,-1 1 0,-2 1 0,1-1 0,0 2 0,0-1 0,0 0 0,0 1 0,0-1 0,1 1 0,-1 0 0,1 0 0,0 0 0,0 0 0,-2 4 0,-1 1 0,1 0 0,0 1 0,1-1 0,0 1 0,0 0 0,1 0 0,0 0 0,1 0 0,-1 10 0,2-19 0,0 0 0,0 0 0,0 0 0,0 0 0,0 0 0,0 0 0,0-1 0,0 1 0,0 0 0,0 0 0,0 0 0,0 0 0,0 0 0,0 0 0,0 0 0,0 0 0,0 0 0,0 0 0,1 0 0,-1-1 0,0 1 0,0 0 0,0 0 0,0 0 0,0 0 0,0 0 0,0 0 0,0 0 0,0 0 0,1 0 0,-1 0 0,0 0 0,0 0 0,0 0 0,0 0 0,0 0 0,0 0 0,0 0 0,0 0 0,1 0 0,-1 0 0,0 0 0,0 0 0,0 0 0,0 0 0,0 0 0,0 0 0,0 0 0,0 1 0,0-1 0,0 0 0,1 0 0,-1 0 0,0 0 0,0 0 0,0 0 0,0 0 0,0 0 0,0 0 0,0 0 0,0 0 0,0 1 0,0-1 0,0 0 0,0 0 0,0 0 0,10-13 0,6-18 0,-6-8 0,1 1 0,-11 38 0,0 0 0,0 0 0,0 0 0,0 0 0,0 0 0,0 0 0,0 0 0,0 0 0,0 0 0,0 1 0,0-1 0,0 0 0,0 0 0,0 0 0,0 0 0,0 0 0,0 0 0,0 0 0,0 0 0,0 0 0,0 0 0,1 0 0,-1 0 0,0 0 0,0 1 0,0-1 0,0 0 0,0 0 0,0 0 0,0 0 0,0 0 0,0 0 0,0 0 0,0 0 0,1 0 0,-1 0 0,0 0 0,0 0 0,0 0 0,0 0 0,0 0 0,0 0 0,0 0 0,0 0 0,0 0 0,0 0 0,1 0 0,-1 0 0,0 0 0,0 0 0,0 0 0,0 0 0,0-1 0,1 28 0,-1-24 0,0 0 0,0 0 0,0-1 0,1 1 0,-1 0 0,1 0 0,0 0 0,0 0 0,0-1 0,0 1 0,0 0 0,0-1 0,1 1 0,-1-1 0,1 1 0,0-1 0,0 0 0,0 0 0,0 0 0,3 3 0,-3-4 0,0 0 0,-1-1 0,1 1 0,0-1 0,-1 1 0,1-1 0,0 0 0,0 1 0,-1-1 0,1 0 0,0 0 0,0 0 0,0-1 0,-1 1 0,1 0 0,0-1 0,-1 1 0,1-1 0,0 1 0,-1-1 0,1 0 0,0 0 0,-1 0 0,1 0 0,-1 0 0,0 0 0,1 0 0,-1 0 0,0 0 0,0-1 0,0 1 0,1 0 0,-1-1 0,-1 1 0,2-3 0,1-1 0,0 1 0,0-1 0,-1 0 0,1 0 0,-1 1 0,-1-1 0,1-1 0,-1 1 0,0 0 0,0 0 0,0 0 0,-1-1 0,0-9 0,0 12 0,0 1 0,-1-1 0,1 1 0,-1-1 0,0 0 0,0 1 0,0-1 0,0 1 0,0 0 0,0-1 0,0 1 0,-1 0 0,1 0 0,-1 0 0,0 0 0,0 0 0,0 0 0,0 0 0,0 1 0,0-1 0,0 1 0,0-1 0,-1 1 0,1 0 0,0 0 0,-1 0 0,1 0 0,-1 0 0,-4 0 0,-2-1 0,0 0 0,-1 1 0,0 0 0,1 1 0,-1 0 0,0 1 0,1 0 0,-1 0 0,1 1 0,-1 0 0,-9 3 0,15-3 0,0 0 0,0 1 0,0-1 0,0 1 0,0-1 0,0 1 0,1 0 0,-1 1 0,1-1 0,0 0 0,0 1 0,0 0 0,0 0 0,1 0 0,0 0 0,0 0 0,0 0 0,0 1 0,0-1 0,1 1 0,0-1 0,0 1 0,0 0 0,0 6 0,0 0 0,0 0 0,1-1 0,0 1 0,1 0 0,0 0 0,5 20 0,-5-28 0,0-1 0,0 0 0,-1 1 0,1-1 0,1 0 0,-1 0 0,0 0 0,0 0 0,1 0 0,-1 0 0,1 0 0,0-1 0,0 1 0,-1 0 0,1-1 0,0 1 0,0-1 0,0 0 0,1 0 0,-1 0 0,0 0 0,0 0 0,1 0 0,-1-1 0,0 1 0,1-1 0,-1 1 0,0-1 0,1 0 0,-1 0 0,1 0 0,-1 0 0,1-1 0,-1 1 0,0-1 0,1 1 0,1-2 0,2 0 0,0 0 0,0-1 0,0 0 0,-1 0 0,1-1 0,-1 0 0,0 1 0,0-2 0,0 1 0,-1 0 0,0-1 0,1 0 0,-2 0 0,1 0 0,0-1 0,-1 1 0,3-8 0,-3 8 0,0-1 0,-1-1 0,1 1 0,-1 0 0,0-1 0,-1 1 0,0-1 0,0 0 0,0 1 0,-1-1 0,0 0 0,0 1 0,0-1 0,-1 0 0,0 1 0,-3-10 0,4 14 0,-1 0 0,0 0 0,0 0 0,1 0 0,-1 0 0,-1 0 0,1 1 0,0-1 0,0 0 0,0 1 0,-1-1 0,1 1 0,-1-1 0,0 1 0,1 0 0,-1-1 0,0 1 0,0 0 0,1 0 0,-1 0 0,0 0 0,0 1 0,0-1 0,0 1 0,0-1 0,0 1 0,-1-1 0,1 1 0,0 0 0,0 0 0,0 0 0,0 0 0,0 1 0,0-1 0,0 1 0,0-1 0,0 1 0,0-1 0,0 1 0,0 0 0,0 0 0,-3 2 0,-3 2 0,0 0 0,0 1 0,0 0 0,1 0 0,0 0 0,1 1 0,-1 0 0,-6 10 0,5-6 0,-34 56 0,40-64 0,0 1 0,0-1 0,0 1 0,1-1 0,0 1 0,0 0 0,0 0 0,0-1 0,0 1 0,1 0 0,-1 0 0,1 0 0,0 0 0,1 0 0,-1 0 0,1 4 0,1-6 0,-1 0 0,1 0 0,-1 0 0,1-1 0,0 1 0,0 0 0,0-1 0,0 1 0,0-1 0,0 0 0,0 0 0,0 1 0,1-2 0,-1 1 0,0 0 0,1 0 0,-1-1 0,0 1 0,1-1 0,-1 1 0,1-1 0,3 0 0,57-3 0,-62 3 0,7-1 0,-1 0 0,1-1 0,-1 0 0,0 0 0,0-1 0,0 0 0,0 0 0,0 0 0,0-1 0,7-6 0,-10 7 0,-1 1 0,0-1 0,-1 1 0,1-1 0,0 0 0,-1 0 0,0 0 0,1-1 0,-1 1 0,0 0 0,-1-1 0,1 0 0,-1 1 0,1-1 0,-1 0 0,0 0 0,-1 1 0,1-1 0,-1 0 0,1 0 0,-1-5 0,-1 8 0,1-1 0,0 0 0,0 0 0,-1 0 0,1 0 0,-1 1 0,1-1 0,-1 0 0,0 0 0,0 1 0,0-1 0,0 0 0,0 1 0,0-1 0,0 1 0,-1 0 0,1-1 0,0 1 0,-1 0 0,1 0 0,-1 0 0,-2-2 0,1 2 0,-1-1 0,1 1 0,-1 0 0,1 1 0,-1-1 0,1 0 0,-1 1 0,1 0 0,-1 0 0,0 0 0,-5 1 0,5-1 0,0 1 0,0 0 0,0 0 0,0 0 0,0 0 0,0 0 0,0 1 0,0 0 0,0-1 0,1 2 0,-1-1 0,1 0 0,-1 1 0,1-1 0,0 1 0,0 0 0,0 0 0,1 0 0,-1 1 0,1-1 0,-3 5 0,4-8 0,1 1 0,0-1 0,0 0 0,0 0 0,0 0 0,0 0 0,0 0 0,0 1 0,0-1 0,0 0 0,0 0 0,0 0 0,0 0 0,0 1 0,0-1 0,0 0 0,0 0 0,0 0 0,0 0 0,0 1 0,0-1 0,0 0 0,0 0 0,0 0 0,0 0 0,1 0 0,-1 1 0,0-1 0,0 0 0,0 0 0,0 0 0,0 0 0,0 0 0,0 0 0,1 1 0,-1-1 0,0 0 0,0 0 0,0 0 0,0 0 0,1 0 0,-1 0 0,0 0 0,0 0 0,0 0 0,0 0 0,0 0 0,1 0 0,-1 0 0,0 0 0,0 0 0,0 0 0,1 0 0,13-4 0,12-11 0,-11 1 0,-13 12 0,1-1 0,-1 0 0,0 1 0,1 0 0,-1-1 0,1 1 0,0 0 0,-1 0 0,1 0 0,0 1 0,0-1 0,1 1 0,-1 0 0,0 0 0,0 0 0,1 0 0,3 0 0,-6 3 0,0 0 0,-1 0 0,1 0 0,-1 0 0,1 0 0,-1 1 0,0-1 0,0 0 0,0 0 0,0 1 0,0-1 0,0 0 0,-1 0 0,1 0 0,-1 1 0,1-1 0,-3 3 0,1 5 0,6 15 0,-1-21 0,0-15 0,-4 8 0,1 0 0,-1 0 0,1 0 0,-1 0 0,0 1 0,0-1 0,0 0 0,0 1 0,0-1 0,-1 1 0,1-1 0,-1 1 0,0 0 0,1-1 0,-1 1 0,0 0 0,-1 0 0,1 1 0,0-1 0,0 0 0,-1 1 0,1-1 0,-1 1 0,1 0 0,-1-1 0,-4 0 0,3 1 0,0-1 0,1 1 0,-1 0 0,0 0 0,0 0 0,0 1 0,0-1 0,0 1 0,0 0 0,1 0 0,-1 1 0,0-1 0,0 1 0,0-1 0,0 1 0,0 1 0,1-1 0,-1 0 0,-3 3 0,6-3 0,0-1 0,0 1 0,1-1 0,-1 1 0,1 0 0,-1-1 0,1 1 0,-1 0 0,1-1 0,-1 1 0,1 0 0,-1 0 0,1 0 0,0-1 0,0 1 0,-1 0 0,1 0 0,0 0 0,0 0 0,0 0 0,0 0 0,0-1 0,0 1 0,0 0 0,0 0 0,0 0 0,1 0 0,-1 1 0,1 1 0,1-1 0,-1 1 0,0 0 0,1-1 0,-1 1 0,1-1 0,0 1 0,0-1 0,2 3 0,-2-3 0,0 0 0,-1-1 0,1 1 0,0 0 0,0-1 0,0 1 0,0-1 0,0 1 0,0-1 0,0 0 0,1 0 0,-1 0 0,0 0 0,1 0 0,-1-1 0,1 1 0,-1-1 0,1 1 0,-1-1 0,1 0 0,-1 0 0,5-1 0,-6 1 0,0-1 0,-1 0 0,1 1 0,-1-1 0,1 0 0,-1 0 0,1 1 0,-1-1 0,1 0 0,-1 0 0,0 0 0,0 0 0,1 0 0,-1 0 0,0 1 0,0-1 0,0 0 0,0 0 0,0 0 0,0 0 0,0 0 0,0 0 0,0 0 0,-1 0 0,1 1 0,0-1 0,-1 0 0,1 0 0,0 0 0,-1 0 0,0-1 0,0 2 0,1-1 0,-1 1 0,1-1 0,0 1 0,-1 0 0,1-1 0,0 1 0,-1-1 0,1 0 0,0 1 0,0-1 0,-1 1 0,1-1 0,0 1 0,0-1 0,0 0 0,0 1 0,0-1 0,0 1 0,0-1 0,0 0 0,0 1 0,0-1 0,0 1 0,0-1 0,0 1 0,1-1 0,-1 0 0,0 1 0,0-1 0,1 1 0,-1-1 0,0 1 0,1-1 0,-1 1 0,0-1 0,1 1 0,-1 0 0,1-1 0,-1 1 0,1-1 0,-1 1 0,1 0 0,-1 0 0,1-1 0,-1 1 0,1 0 0,-1 0 0,1-1 0,0 1 0,-1 0 0,1 0 0,-1 0 0,2 0 0,5 0 0,1 1 0,0 0 0,-1 0 0,1 1 0,0 0 0,9 4 0,-10-3 0,-1-1 0,0 0 0,1-1 0,-1 1 0,1-1 0,0 0 0,10-1 0,-17 0 0,1 0 0,-1 0 0,1 0 0,-1 0 0,1 0 0,-1 0 0,0 0 0,1 0 0,-1 0 0,1 0 0,-1 0 0,0-1 0,1 1 0,-1 0 0,0 0 0,1 0 0,-1-1 0,0 1 0,1 0 0,-1 0 0,0-1 0,1 1 0,-1 0 0,0-1 0,0 1 0,0 0 0,1-1 0,-1 1 0,0-1 0,0 1 0,0 0 0,0-1 0,0 1 0,1-1 0,-1 1 0,0 0 0,0-1 0,0 1 0,0-1 0,-10-19 0,-21-14 0,18 21 0,-12-9 0,-36-27 0,55 44 0,0 1 0,0 1 0,0-1 0,-1 1 0,1 0 0,-1 0 0,1 1 0,-1 0 0,0 0 0,0 0 0,0 1 0,-13-1 0,18 3 0,-1-1 0,1 0 0,0 0 0,-1 1 0,1 0 0,0-1 0,0 1 0,0 0 0,-1 0 0,1 0 0,0 0 0,0 1 0,0-1 0,1 0 0,-1 1 0,0 0 0,0-1 0,1 1 0,-1 0 0,1 0 0,-2 2 0,1 0 0,0 1 0,0-1 0,1 0 0,0 1 0,-1-1 0,2 1 0,-1-1 0,0 1 0,1 0 0,0 6 0,0-2 0,1 0 0,0-1 0,1 1 0,-1 0 0,2-1 0,-1 1 0,1-1 0,0 0 0,1 1 0,0-2 0,5 9 0,-6-13 0,0 1 0,0-1 0,0 0 0,1 0 0,-1 0 0,1 0 0,0-1 0,0 0 0,-1 1 0,2-1 0,-1-1 0,0 1 0,0-1 0,0 1 0,1-1 0,-1 0 0,1-1 0,-1 1 0,1-1 0,-1 0 0,1 0 0,-1 0 0,1-1 0,-1 1 0,0-1 0,1 0 0,-1 0 0,0-1 0,1 0 0,-1 1 0,0-1 0,0 0 0,0-1 0,-1 1 0,1-1 0,-1 0 0,1 0 0,-1 0 0,0 0 0,0 0 0,0-1 0,0 0 0,-1 1 0,1-1 0,-1 0 0,0 0 0,0 0 0,-1-1 0,1 1 0,-1 0 0,0 0 0,0-1 0,0 1 0,-1-8 0,1 10 0,-1 0 0,0 0 0,0 0 0,0 0 0,0 0 0,-1 0 0,1 0 0,0 0 0,-1 0 0,0 0 0,1 0 0,-1 0 0,0 0 0,0 0 0,0 1 0,0-1 0,0 0 0,0 0 0,-1 1 0,1-1 0,-1 1 0,1-1 0,-1 1 0,1 0 0,-1 0 0,0 0 0,1 0 0,-1 0 0,0 0 0,0 0 0,0 0 0,0 1 0,0-1 0,0 1 0,0-1 0,0 1 0,0 0 0,0 0 0,0 0 0,0 0 0,0 0 0,-4 1 0,1-1 0,0 1 0,-1 0 0,1 0 0,0 1 0,0-1 0,0 1 0,0 0 0,1 0 0,-1 1 0,0-1 0,1 1 0,0 0 0,0 0 0,0 1 0,0-1 0,-4 6 0,4-3 0,1-1 0,0 1 0,0 0 0,1 0 0,-1 0 0,2 1 0,-1-1 0,0 1 0,1-1 0,1 1 0,-1-1 0,1 1 0,0-1 0,0 1 0,3 12 0,-3-16 0,1-1 0,0 1 0,0 0 0,-1-1 0,2 0 0,-1 1 0,0-1 0,0 0 0,1 1 0,-1-1 0,1 0 0,0 0 0,0 0 0,0-1 0,0 1 0,0 0 0,0-1 0,0 1 0,0-1 0,0 0 0,1 1 0,-1-1 0,1 0 0,-1-1 0,1 1 0,-1 0 0,1-1 0,0 1 0,-1-1 0,1 0 0,-1 0 0,1 0 0,0 0 0,-1 0 0,1-1 0,0 1 0,-1-1 0,1 0 0,-1 1 0,5-3 0,-2 0 0,1 1 0,-1-1 0,0 0 0,0 0 0,0 0 0,0-1 0,-1 0 0,1 0 0,-1 0 0,0 0 0,0-1 0,0 1 0,-1-1 0,0 0 0,0 0 0,3-6 0,-2 2 0,0-1 0,0 1 0,-1 0 0,0-1 0,0 0 0,-1 0 0,-1 0 0,1-17 0,-6 6 0,-6 16 0,8 6 0,1 0 0,-1 0 0,1 0 0,-1 0 0,1 0 0,0 0 0,-1 0 0,1 1 0,0-1 0,0 0 0,0 1 0,0-1 0,0 1 0,0-1 0,0 1 0,0 0 0,1-1 0,-1 3 0,-3 6 0,1 0 0,0 1 0,1 0 0,-1 11 0,7 12 0,-4-33 0,0 0 0,1 0 0,-1 0 0,1 0 0,-1 0 0,1 0 0,0 0 0,-1-1 0,1 1 0,0 0 0,-1 0 0,1-1 0,0 1 0,0 0 0,0-1 0,0 1 0,0-1 0,0 1 0,0-1 0,0 0 0,0 1 0,0-1 0,0 0 0,2 1 0,-1-2 0,0 1 0,1 0 0,-1 0 0,0-1 0,1 0 0,-1 1 0,0-1 0,1 0 0,-1 0 0,0 0 0,0 0 0,0 0 0,0-1 0,0 1 0,0-1 0,-1 1 0,1-1 0,0 0 0,-1 0 0,3-2 0,-4 4 0,0 0 0,0-1 0,0 1 0,1 0 0,-1 0 0,0 0 0,0 0 0,0 0 0,0 0 0,1 0 0,-1 0 0,0-1 0,0 1 0,0 0 0,0 0 0,0 0 0,0 0 0,1 0 0,-1-1 0,0 1 0,0 0 0,0 0 0,0 0 0,0-1 0,0 1 0,0 0 0,0 0 0,0 0 0,0-1 0,0 1 0,0 0 0,0 0 0,0 0 0,0 0 0,0-1 0,0 1 0,0 0 0,0 0 0,0 0 0,0-1 0,0 1 0,0 0 0,-1 0 0,1 0 0,0 0 0,0-1 0,0 1 0,0 0 0,0 0 0,0 0 0,-1 0 0,1 0 0,0 0 0,0 0 0,0-1 0,-1 1 0,-22 19 0,13-3 0,3-6 0,-13-11 0,-22-14 0,37 12 0,-2 1 0,1-1 0,0 1 0,0 0 0,-1 1 0,-12-3 0,69 27 0,-15-17 0,-4-1 0,-26-3 0,-14 0 0,7-2 0,0 1 0,0-1 0,0 0 0,0 1 0,-1 0 0,1-1 0,0 1 0,0 0 0,0 0 0,0 0 0,0 0 0,1 0 0,-1 1 0,-2 1 0,3-2 0,1 0 0,-1 0 0,0 0 0,1 0 0,-1 0 0,1 0 0,-1 0 0,1 0 0,0 0 0,0 0 0,-1 0 0,1 0 0,0 0 0,0 1 0,0-1 0,0 0 0,0 0 0,0 0 0,0 0 0,1 2 0,0 0 0,1 1 0,0-1 0,-1 0 0,1 1 0,0-1 0,0 0 0,1-1 0,-1 1 0,1 0 0,-1 0 0,1-1 0,0 0 0,0 0 0,0 1 0,5 1 0,-3-1 0,1-1 0,-1 1 0,1-1 0,0 0 0,-1-1 0,1 1 0,0-1 0,0-1 0,0 1 0,0-1 0,12-1 0,-16 1 0,0 0 0,0-1 0,0 1 0,0-1 0,0 1 0,0-1 0,-1 0 0,1 0 0,0 0 0,0 0 0,-1 0 0,1-1 0,0 1 0,-1 0 0,1-1 0,-1 1 0,0-1 0,1 1 0,-1-1 0,0 0 0,0 0 0,0 1 0,0-1 0,0 0 0,-1 0 0,1 0 0,-1 0 0,1 0 0,-1 0 0,1 0 0,-1 0 0,0 0 0,0 0 0,0 0 0,0 0 0,-1 0 0,0-3 0,-1-4 0,0 0 0,0 1 0,-1-1 0,-1 1 0,1 0 0,-1 0 0,-1 0 0,0 1 0,0-1 0,0 1 0,-1 0 0,0 0 0,-9-7 0,2 2 0,0 0 0,-1 2 0,0-1 0,-1 2 0,-30-15 0,44 23 0,0 0 0,-1 0 0,1 1 0,0-1 0,-1 1 0,1 0 0,-1-1 0,1 1 0,-1 0 0,1 0 0,-1 0 0,1 0 0,-1 0 0,1 0 0,-1 0 0,1 0 0,0 1 0,-1-1 0,1 0 0,-1 1 0,1-1 0,0 1 0,-1 0 0,1 0 0,-2 0 0,2 1 0,-1 0 0,0 0 0,1 1 0,-1-1 0,1 0 0,-1 1 0,1-1 0,0 1 0,0-1 0,0 1 0,1 0 0,-2 4 0,0 11 0,1 0 0,0-1 0,3 27 0,-1-31 0,-1-9 0,0 4 0,0 0 0,0 0 0,1 0 0,0 0 0,1 0 0,4 13 0,-5-20 0,-1 0 0,1-1 0,-1 1 0,1 0 0,-1 0 0,1-1 0,-1 1 0,1 0 0,0-1 0,-1 1 0,1 0 0,0-1 0,0 1 0,-1-1 0,1 1 0,0-1 0,0 0 0,0 1 0,0-1 0,-1 0 0,1 0 0,0 1 0,0-1 0,2 0 0,0-1 0,0 1 0,-1-1 0,1 0 0,0 0 0,0 0 0,-1 0 0,1 0 0,-1-1 0,1 1 0,-1-1 0,1 0 0,1-2 0,5-4 0,0-1 0,-1 0 0,0-1 0,-1 0 0,12-20 0,-12 19 0,-1 0 0,2 1 0,-1 0 0,17-17 0,-26 31 0,1 0 0,0 0 0,0 0 0,0 0 0,0 0 0,1 0 0,0 0 0,-1 0 0,2 1 0,-1-1 0,0 0 0,1 0 0,0 0 0,2 7 0,-3-11 0,0 0 0,0 0 0,0 1 0,1-1 0,-1 0 0,0 0 0,0 1 0,0-1 0,0 0 0,0 0 0,1 1 0,-1-1 0,0 0 0,0 0 0,0 1 0,0-1 0,0 0 0,0 0 0,0 1 0,0-1 0,0 0 0,0 1 0,0-1 0,0 0 0,0 0 0,0 1 0,0-1 0,-1 0 0,1 0 0,0 1 0,0-1 0,0 0 0,0 0 0,0 1 0,-1-1 0,1 0 0,0 0 0,0 1 0,0-1 0,-1 0 0,1 0 0,0 0 0,0 0 0,-1 1 0,-19 3 0,-35-5 0,44 1 0,1 0 0,-23-1 0,33 0 0,20 1 0,-13 0 0,-4-1 0,1 1 0,-1 0 0,1 0 0,-1 0 0,1 0 0,-1 1 0,0-1 0,1 1 0,-1 0 0,1 0 0,-1 0 0,0 0 0,7 4 0,-10-4 0,-1-1 0,1 1 0,0-1 0,0 0 0,0 1 0,0-1 0,0 1 0,-1-1 0,1 0 0,0 1 0,0-1 0,0 1 0,-1-1 0,1 0 0,0 1 0,-1-1 0,1 0 0,0 1 0,-1-1 0,1 0 0,0 0 0,-1 1 0,1-1 0,-1 0 0,1 0 0,0 0 0,-1 0 0,1 0 0,-1 1 0,1-1 0,-1 0 0,1 0 0,-1 0 0,1 0 0,0 0 0,-1 0 0,0-1 0,-20 5 0,12-3 0,1-1 0,-1 0 0,1 0 0,0-1 0,-1 0 0,1 0 0,0-1 0,-1-1 0,1 1 0,1-1 0,-1 0 0,0-1 0,1 0 0,-1 0 0,-7-7 0,11 8 0,0 0 0,0 0 0,1-1 0,-1 0 0,1 1 0,0-1 0,0 0 0,0-1 0,0 1 0,1-1 0,0 1 0,0-1 0,0 1 0,0-1 0,1 0 0,0 0 0,0 0 0,0 0 0,1 0 0,0 0 0,-1 0 0,2 0 0,-1 0 0,1 0 0,-1 0 0,3-7 0,-2 8 14,1 1-1,-1-1 0,0 1 0,1-1 1,0 1-1,0 0 0,0 0 1,3-5-1,-4 7-70,0 0 0,0 0 0,0 0 0,0 0-1,0 1 1,1-1 0,-1 0 0,0 0 0,0 1 0,0-1 0,1 1 0,-1-1-1,0 1 1,1 0 0,-1-1 0,0 1 0,1 0 0,-1 0 0,0 0 0,1 0 0,-1 0-1,1 0 1,-1 0 0,0 0 0,3 1 0,13 8-6769</inkml:trace>
+</inkml:ink>
 </file>
 
 <file path=word/theme/theme1.xml><?xml version="1.0" encoding="utf-8"?>
@@ -2132,4 +2958,16 @@
     </a:ext>
   </a:extLst>
 </a:theme>
+</file>
+
+<file path=customXml/item1.xml><?xml version="1.0" encoding="utf-8"?>
+<b:Sources xmlns:b="http://schemas.openxmlformats.org/officeDocument/2006/bibliography" xmlns="http://schemas.openxmlformats.org/officeDocument/2006/bibliography" SelectedStyle="\APASixthEditionOfficeOnline.xsl" StyleName="APA" Version="6"/>
+</file>
+
+<file path=customXml/itemProps1.xml><?xml version="1.0" encoding="utf-8"?>
+<ds:datastoreItem xmlns:ds="http://schemas.openxmlformats.org/officeDocument/2006/customXml" ds:itemID="{AED9D590-8AC6-43EA-B910-EA517B4B7E8E}">
+  <ds:schemaRefs>
+    <ds:schemaRef ds:uri="http://schemas.openxmlformats.org/officeDocument/2006/bibliography"/>
+  </ds:schemaRefs>
+</ds:datastoreItem>
 </file>
</xml_diff>